<commit_message>
Added additional fairness and proxy audit
</commit_message>
<xml_diff>
--- a/docs/Employee_Retention_Predictor_Capstone_Report.docx
+++ b/docs/Employee_Retention_Predictor_Capstone_Report.docx
@@ -5090,12 +5090,12 @@
       <w:pPr>
         <w:pStyle w:val="Heading1"/>
       </w:pPr>
-      <w:bookmarkStart w:id="0" w:name="executive-summary"/>
-      <w:bookmarkStart w:id="1" w:name="_Toc240021221"/>
+      <w:bookmarkStart w:id="0" w:name="_Toc240021221"/>
+      <w:bookmarkStart w:id="1" w:name="executive-summary"/>
       <w:r>
         <w:t>Executive Summary</w:t>
       </w:r>
-      <w:bookmarkEnd w:id="1"/>
+      <w:bookmarkEnd w:id="0"/>
     </w:p>
     <w:p>
       <w:pPr>
@@ -5313,13 +5313,13 @@
       <w:pPr>
         <w:pStyle w:val="Heading1"/>
       </w:pPr>
-      <w:bookmarkStart w:id="2" w:name="company-overview"/>
-      <w:bookmarkStart w:id="3" w:name="_Toc240021222"/>
-      <w:bookmarkEnd w:id="0"/>
+      <w:bookmarkStart w:id="2" w:name="_Toc240021222"/>
+      <w:bookmarkStart w:id="3" w:name="company-overview"/>
+      <w:bookmarkEnd w:id="1"/>
       <w:r>
         <w:t>Company Overview</w:t>
       </w:r>
-      <w:bookmarkEnd w:id="3"/>
+      <w:bookmarkEnd w:id="2"/>
     </w:p>
     <w:p>
       <w:pPr>
@@ -5440,24 +5440,24 @@
       <w:pPr>
         <w:pStyle w:val="Heading1"/>
       </w:pPr>
-      <w:bookmarkStart w:id="4" w:name="team-and-project"/>
-      <w:bookmarkStart w:id="5" w:name="_Toc240021223"/>
-      <w:bookmarkEnd w:id="2"/>
+      <w:bookmarkStart w:id="4" w:name="_Toc240021223"/>
+      <w:bookmarkStart w:id="5" w:name="team-and-project"/>
+      <w:bookmarkEnd w:id="3"/>
       <w:r>
         <w:t>Team and Project</w:t>
       </w:r>
-      <w:bookmarkEnd w:id="5"/>
+      <w:bookmarkEnd w:id="4"/>
     </w:p>
     <w:p>
       <w:pPr>
         <w:pStyle w:val="Heading2"/>
       </w:pPr>
-      <w:bookmarkStart w:id="6" w:name="project-description"/>
-      <w:bookmarkStart w:id="7" w:name="_Toc240021224"/>
+      <w:bookmarkStart w:id="6" w:name="_Toc240021224"/>
+      <w:bookmarkStart w:id="7" w:name="project-description"/>
       <w:r>
         <w:t>Project Description</w:t>
       </w:r>
-      <w:bookmarkEnd w:id="7"/>
+      <w:bookmarkEnd w:id="6"/>
     </w:p>
     <w:p>
       <w:pPr>
@@ -5582,13 +5582,13 @@
       <w:pPr>
         <w:pStyle w:val="Heading2"/>
       </w:pPr>
-      <w:bookmarkStart w:id="8" w:name="team-name-and-organization"/>
-      <w:bookmarkStart w:id="9" w:name="_Toc240021225"/>
-      <w:bookmarkEnd w:id="6"/>
+      <w:bookmarkStart w:id="8" w:name="_Toc240021225"/>
+      <w:bookmarkStart w:id="9" w:name="team-name-and-organization"/>
+      <w:bookmarkEnd w:id="7"/>
       <w:r>
         <w:t>Team Name and Organization</w:t>
       </w:r>
-      <w:bookmarkEnd w:id="9"/>
+      <w:bookmarkEnd w:id="8"/>
     </w:p>
     <w:p>
       <w:pPr>
@@ -5691,13 +5691,13 @@
       <w:pPr>
         <w:pStyle w:val="Heading2"/>
       </w:pPr>
-      <w:bookmarkStart w:id="10" w:name="skills-concerns"/>
-      <w:bookmarkStart w:id="11" w:name="_Toc240021226"/>
-      <w:bookmarkEnd w:id="8"/>
+      <w:bookmarkStart w:id="10" w:name="_Toc240021226"/>
+      <w:bookmarkStart w:id="11" w:name="skills-concerns"/>
+      <w:bookmarkEnd w:id="9"/>
       <w:r>
         <w:t>Skills Concerns</w:t>
       </w:r>
-      <w:bookmarkEnd w:id="11"/>
+      <w:bookmarkEnd w:id="10"/>
     </w:p>
     <w:p>
       <w:pPr>
@@ -5902,25 +5902,25 @@
       <w:pPr>
         <w:pStyle w:val="Heading1"/>
       </w:pPr>
-      <w:bookmarkStart w:id="12" w:name="strategic-analysis"/>
-      <w:bookmarkStart w:id="13" w:name="_Toc240021227"/>
-      <w:bookmarkEnd w:id="4"/>
-      <w:bookmarkEnd w:id="10"/>
+      <w:bookmarkStart w:id="12" w:name="_Toc240021227"/>
+      <w:bookmarkStart w:id="13" w:name="strategic-analysis"/>
+      <w:bookmarkEnd w:id="5"/>
+      <w:bookmarkEnd w:id="11"/>
       <w:r>
         <w:t>Strategic Analysis</w:t>
       </w:r>
-      <w:bookmarkEnd w:id="13"/>
+      <w:bookmarkEnd w:id="12"/>
     </w:p>
     <w:p>
       <w:pPr>
         <w:pStyle w:val="Heading2"/>
       </w:pPr>
-      <w:bookmarkStart w:id="14" w:name="external-analysis"/>
-      <w:bookmarkStart w:id="15" w:name="_Toc240021228"/>
+      <w:bookmarkStart w:id="14" w:name="_Toc240021228"/>
+      <w:bookmarkStart w:id="15" w:name="external-analysis"/>
       <w:r>
         <w:t>External Analysis</w:t>
       </w:r>
-      <w:bookmarkEnd w:id="15"/>
+      <w:bookmarkEnd w:id="14"/>
     </w:p>
     <w:p>
       <w:pPr>
@@ -6100,13 +6100,13 @@
       <w:pPr>
         <w:pStyle w:val="Heading2"/>
       </w:pPr>
-      <w:bookmarkStart w:id="16" w:name="internal-analysis"/>
-      <w:bookmarkStart w:id="17" w:name="_Toc240021229"/>
-      <w:bookmarkEnd w:id="14"/>
+      <w:bookmarkStart w:id="16" w:name="_Toc240021229"/>
+      <w:bookmarkStart w:id="17" w:name="internal-analysis"/>
+      <w:bookmarkEnd w:id="15"/>
       <w:r>
         <w:t>Internal Analysis</w:t>
       </w:r>
-      <w:bookmarkEnd w:id="17"/>
+      <w:bookmarkEnd w:id="16"/>
     </w:p>
     <w:p>
       <w:pPr>
@@ -6244,7 +6244,13 @@
         <w:t>The quantified gap.</w:t>
       </w:r>
       <w:r>
-        <w:t xml:space="preserve"> The financial consequence is directly calculable from the client’s own record. Departing employees carry a mean monthly income of $4,787, against $6,833 for those who stay — a signal that attrition is concentrated in earlier-career and lower-band roles, though not exclusively so. Annualised, the mean departing salary is $57,444. At a 1.5× replacement multiplier, each departure costs </w:t>
+        <w:t xml:space="preserve"> The financial consequence is directly calculable from the client’s own record. Departing employees carry a mean monthly income of $4,787, against $6,833 for those who stay — a signal that attrition is concentrated in earlier-career and lower-band roles, though not exclusively so. Annualised, the mean departing salary is $57,44</w:t>
+      </w:r>
+      <w:r>
+        <w:t>5</w:t>
+      </w:r>
+      <w:r>
+        <w:t xml:space="preserve">. At a 1.5× replacement multiplier, each departure costs </w:t>
       </w:r>
       <w:r>
         <w:rPr>
@@ -6289,14 +6295,14 @@
       <w:pPr>
         <w:pStyle w:val="Heading1"/>
       </w:pPr>
-      <w:bookmarkStart w:id="18" w:name="analytics-opportunity"/>
-      <w:bookmarkStart w:id="19" w:name="_Toc240021230"/>
-      <w:bookmarkEnd w:id="12"/>
-      <w:bookmarkEnd w:id="16"/>
+      <w:bookmarkStart w:id="18" w:name="_Toc240021230"/>
+      <w:bookmarkStart w:id="19" w:name="analytics-opportunity"/>
+      <w:bookmarkEnd w:id="13"/>
+      <w:bookmarkEnd w:id="17"/>
       <w:r>
         <w:t>Analytics Opportunity</w:t>
       </w:r>
-      <w:bookmarkEnd w:id="19"/>
+      <w:bookmarkEnd w:id="18"/>
     </w:p>
     <w:p>
       <w:pPr>
@@ -6479,14 +6485,14 @@
       <w:pPr>
         <w:pStyle w:val="Heading1"/>
       </w:pPr>
-      <w:bookmarkStart w:id="20" w:name="rationale"/>
-      <w:bookmarkStart w:id="21" w:name="_Toc240021231"/>
-      <w:bookmarkEnd w:id="18"/>
+      <w:bookmarkStart w:id="20" w:name="_Toc240021231"/>
+      <w:bookmarkStart w:id="21" w:name="rationale"/>
+      <w:bookmarkEnd w:id="19"/>
       <w:r>
         <w:lastRenderedPageBreak/>
         <w:t>Rationale</w:t>
       </w:r>
-      <w:bookmarkEnd w:id="21"/>
+      <w:bookmarkEnd w:id="20"/>
     </w:p>
     <w:p>
       <w:pPr>
@@ -6698,24 +6704,24 @@
       <w:pPr>
         <w:pStyle w:val="Heading1"/>
       </w:pPr>
-      <w:bookmarkStart w:id="22" w:name="stakeholder-and-requirement-analysis"/>
-      <w:bookmarkStart w:id="23" w:name="_Toc240021232"/>
-      <w:bookmarkEnd w:id="20"/>
+      <w:bookmarkStart w:id="22" w:name="_Toc240021232"/>
+      <w:bookmarkStart w:id="23" w:name="stakeholder-and-requirement-analysis"/>
+      <w:bookmarkEnd w:id="21"/>
       <w:r>
         <w:t>Stakeholder and Requirement Analysis</w:t>
       </w:r>
-      <w:bookmarkEnd w:id="23"/>
+      <w:bookmarkEnd w:id="22"/>
     </w:p>
     <w:p>
       <w:pPr>
         <w:pStyle w:val="Heading2"/>
       </w:pPr>
-      <w:bookmarkStart w:id="24" w:name="key-stakeholders"/>
-      <w:bookmarkStart w:id="25" w:name="_Toc240021233"/>
+      <w:bookmarkStart w:id="24" w:name="_Toc240021233"/>
+      <w:bookmarkStart w:id="25" w:name="key-stakeholders"/>
       <w:r>
         <w:t>Key Stakeholders</w:t>
       </w:r>
-      <w:bookmarkEnd w:id="25"/>
+      <w:bookmarkEnd w:id="24"/>
     </w:p>
     <w:p>
       <w:pPr>
@@ -6800,13 +6806,13 @@
       <w:pPr>
         <w:pStyle w:val="Heading2"/>
       </w:pPr>
-      <w:bookmarkStart w:id="26" w:name="process-flow"/>
-      <w:bookmarkStart w:id="27" w:name="_Toc240021234"/>
-      <w:bookmarkEnd w:id="24"/>
+      <w:bookmarkStart w:id="26" w:name="_Toc240021234"/>
+      <w:bookmarkStart w:id="27" w:name="process-flow"/>
+      <w:bookmarkEnd w:id="25"/>
       <w:r>
         <w:t>Process Flow</w:t>
       </w:r>
-      <w:bookmarkEnd w:id="27"/>
+      <w:bookmarkEnd w:id="26"/>
     </w:p>
     <w:p>
       <w:pPr>
@@ -6850,13 +6856,13 @@
       <w:pPr>
         <w:pStyle w:val="Heading2"/>
       </w:pPr>
-      <w:bookmarkStart w:id="28" w:name="requirements"/>
-      <w:bookmarkStart w:id="29" w:name="_Toc240021235"/>
-      <w:bookmarkEnd w:id="26"/>
+      <w:bookmarkStart w:id="28" w:name="_Toc240021235"/>
+      <w:bookmarkStart w:id="29" w:name="requirements"/>
+      <w:bookmarkEnd w:id="27"/>
       <w:r>
         <w:t>Requirements</w:t>
       </w:r>
-      <w:bookmarkEnd w:id="29"/>
+      <w:bookmarkEnd w:id="28"/>
     </w:p>
     <w:p>
       <w:pPr>
@@ -7137,14 +7143,14 @@
       <w:pPr>
         <w:pStyle w:val="Heading1"/>
       </w:pPr>
-      <w:bookmarkStart w:id="30" w:name="success-criteria"/>
-      <w:bookmarkStart w:id="31" w:name="_Toc240021236"/>
-      <w:bookmarkEnd w:id="22"/>
-      <w:bookmarkEnd w:id="28"/>
+      <w:bookmarkStart w:id="30" w:name="_Toc240021236"/>
+      <w:bookmarkStart w:id="31" w:name="success-criteria"/>
+      <w:bookmarkEnd w:id="23"/>
+      <w:bookmarkEnd w:id="29"/>
       <w:r>
         <w:t>Success Criteria</w:t>
       </w:r>
-      <w:bookmarkEnd w:id="31"/>
+      <w:bookmarkEnd w:id="30"/>
     </w:p>
     <w:p>
       <w:pPr>
@@ -7168,13 +7174,13 @@
       <w:pPr>
         <w:pStyle w:val="Heading2"/>
       </w:pPr>
-      <w:bookmarkStart w:id="32" w:name="technical-success-criteria"/>
-      <w:bookmarkStart w:id="33" w:name="_Toc240021237"/>
+      <w:bookmarkStart w:id="32" w:name="_Toc240021237"/>
+      <w:bookmarkStart w:id="33" w:name="technical-success-criteria"/>
       <w:r>
         <w:lastRenderedPageBreak/>
         <w:t>Technical success criteria</w:t>
       </w:r>
-      <w:bookmarkEnd w:id="33"/>
+      <w:bookmarkEnd w:id="32"/>
     </w:p>
     <w:p>
       <w:pPr>
@@ -7789,13 +7795,13 @@
       <w:pPr>
         <w:pStyle w:val="Heading2"/>
       </w:pPr>
-      <w:bookmarkStart w:id="34" w:name="business-success-criteria"/>
-      <w:bookmarkStart w:id="35" w:name="_Toc240021238"/>
-      <w:bookmarkEnd w:id="32"/>
+      <w:bookmarkStart w:id="34" w:name="_Toc240021238"/>
+      <w:bookmarkStart w:id="35" w:name="business-success-criteria"/>
+      <w:bookmarkEnd w:id="33"/>
       <w:r>
         <w:t>Business success criteria</w:t>
       </w:r>
-      <w:bookmarkEnd w:id="35"/>
+      <w:bookmarkEnd w:id="34"/>
     </w:p>
     <w:tbl>
       <w:tblPr>
@@ -8219,26 +8225,26 @@
       <w:pPr>
         <w:pStyle w:val="Heading1"/>
       </w:pPr>
-      <w:bookmarkStart w:id="36" w:name="scope-and-schedule-of-deliverables"/>
-      <w:bookmarkStart w:id="37" w:name="_Toc240021239"/>
-      <w:bookmarkEnd w:id="30"/>
-      <w:bookmarkEnd w:id="34"/>
+      <w:bookmarkStart w:id="36" w:name="_Toc240021239"/>
+      <w:bookmarkStart w:id="37" w:name="scope-and-schedule-of-deliverables"/>
+      <w:bookmarkEnd w:id="31"/>
+      <w:bookmarkEnd w:id="35"/>
       <w:r>
         <w:lastRenderedPageBreak/>
         <w:t>Scope and Schedule of Deliverables</w:t>
       </w:r>
-      <w:bookmarkEnd w:id="37"/>
+      <w:bookmarkEnd w:id="36"/>
     </w:p>
     <w:p>
       <w:pPr>
         <w:pStyle w:val="Heading2"/>
       </w:pPr>
-      <w:bookmarkStart w:id="38" w:name="feasibility"/>
-      <w:bookmarkStart w:id="39" w:name="_Toc240021240"/>
+      <w:bookmarkStart w:id="38" w:name="_Toc240021240"/>
+      <w:bookmarkStart w:id="39" w:name="feasibility"/>
       <w:r>
         <w:t>Feasibility</w:t>
       </w:r>
-      <w:bookmarkEnd w:id="39"/>
+      <w:bookmarkEnd w:id="38"/>
     </w:p>
     <w:p>
       <w:pPr>
@@ -8374,13 +8380,13 @@
       <w:pPr>
         <w:pStyle w:val="Heading2"/>
       </w:pPr>
-      <w:bookmarkStart w:id="40" w:name="scope"/>
-      <w:bookmarkStart w:id="41" w:name="_Toc240021241"/>
-      <w:bookmarkEnd w:id="38"/>
+      <w:bookmarkStart w:id="40" w:name="_Toc240021241"/>
+      <w:bookmarkStart w:id="41" w:name="scope"/>
+      <w:bookmarkEnd w:id="39"/>
       <w:r>
         <w:t>Scope</w:t>
       </w:r>
-      <w:bookmarkEnd w:id="41"/>
+      <w:bookmarkEnd w:id="40"/>
     </w:p>
     <w:p>
       <w:pPr>
@@ -8660,14 +8666,14 @@
       <w:pPr>
         <w:pStyle w:val="Heading2"/>
       </w:pPr>
-      <w:bookmarkStart w:id="42" w:name="deliverables-and-schedule"/>
-      <w:bookmarkStart w:id="43" w:name="_Toc240021242"/>
-      <w:bookmarkEnd w:id="40"/>
+      <w:bookmarkStart w:id="42" w:name="_Toc240021242"/>
+      <w:bookmarkStart w:id="43" w:name="deliverables-and-schedule"/>
+      <w:bookmarkEnd w:id="41"/>
       <w:r>
         <w:lastRenderedPageBreak/>
         <w:t>Deliverables and Schedule</w:t>
       </w:r>
-      <w:bookmarkEnd w:id="43"/>
+      <w:bookmarkEnd w:id="42"/>
     </w:p>
     <w:p>
       <w:pPr>
@@ -9337,25 +9343,25 @@
       <w:pPr>
         <w:pStyle w:val="Heading1"/>
       </w:pPr>
-      <w:bookmarkStart w:id="44" w:name="data-understanding"/>
-      <w:bookmarkStart w:id="45" w:name="_Toc240021243"/>
-      <w:bookmarkEnd w:id="36"/>
-      <w:bookmarkEnd w:id="42"/>
+      <w:bookmarkStart w:id="44" w:name="_Toc240021243"/>
+      <w:bookmarkStart w:id="45" w:name="data-understanding"/>
+      <w:bookmarkEnd w:id="37"/>
+      <w:bookmarkEnd w:id="43"/>
       <w:r>
         <w:t>Data Understanding</w:t>
       </w:r>
-      <w:bookmarkEnd w:id="45"/>
+      <w:bookmarkEnd w:id="44"/>
     </w:p>
     <w:p>
       <w:pPr>
         <w:pStyle w:val="Heading2"/>
       </w:pPr>
-      <w:bookmarkStart w:id="46" w:name="structure-of-the-dataset"/>
-      <w:bookmarkStart w:id="47" w:name="_Toc240021244"/>
+      <w:bookmarkStart w:id="46" w:name="_Toc240021244"/>
+      <w:bookmarkStart w:id="47" w:name="structure-of-the-dataset"/>
       <w:r>
         <w:t>Structure of the dataset</w:t>
       </w:r>
-      <w:bookmarkEnd w:id="47"/>
+      <w:bookmarkEnd w:id="46"/>
     </w:p>
     <w:p>
       <w:pPr>
@@ -10032,13 +10038,13 @@
       <w:pPr>
         <w:pStyle w:val="Heading2"/>
       </w:pPr>
-      <w:bookmarkStart w:id="48" w:name="the-target-variable-and-its-time-anchor"/>
-      <w:bookmarkStart w:id="49" w:name="_Toc240021245"/>
-      <w:bookmarkEnd w:id="46"/>
+      <w:bookmarkStart w:id="48" w:name="_Toc240021245"/>
+      <w:bookmarkStart w:id="49" w:name="the-target-variable-and-its-time-anchor"/>
+      <w:bookmarkEnd w:id="47"/>
       <w:r>
         <w:t>The target variable and its time anchor</w:t>
       </w:r>
-      <w:bookmarkEnd w:id="49"/>
+      <w:bookmarkEnd w:id="48"/>
     </w:p>
     <w:p>
       <w:pPr>
@@ -10153,13 +10159,13 @@
       <w:pPr>
         <w:pStyle w:val="Heading2"/>
       </w:pPr>
-      <w:bookmarkStart w:id="50" w:name="overall-observations"/>
-      <w:bookmarkStart w:id="51" w:name="_Toc240021246"/>
-      <w:bookmarkEnd w:id="48"/>
+      <w:bookmarkStart w:id="50" w:name="_Toc240021246"/>
+      <w:bookmarkStart w:id="51" w:name="overall-observations"/>
+      <w:bookmarkEnd w:id="49"/>
       <w:r>
         <w:t>Overall observations</w:t>
       </w:r>
-      <w:bookmarkEnd w:id="51"/>
+      <w:bookmarkEnd w:id="50"/>
     </w:p>
     <w:p>
       <w:pPr>
@@ -10203,13 +10209,13 @@
       <w:pPr>
         <w:pStyle w:val="Heading2"/>
       </w:pPr>
-      <w:bookmarkStart w:id="52" w:name="data-preparation"/>
-      <w:bookmarkStart w:id="53" w:name="_Toc240021247"/>
-      <w:bookmarkEnd w:id="50"/>
+      <w:bookmarkStart w:id="52" w:name="_Toc240021247"/>
+      <w:bookmarkStart w:id="53" w:name="data-preparation"/>
+      <w:bookmarkEnd w:id="51"/>
       <w:r>
         <w:t>Data Preparation</w:t>
       </w:r>
-      <w:bookmarkEnd w:id="53"/>
+      <w:bookmarkEnd w:id="52"/>
     </w:p>
     <w:p>
       <w:pPr>
@@ -10871,15 +10877,15 @@
       <w:pPr>
         <w:pStyle w:val="Heading1"/>
       </w:pPr>
-      <w:bookmarkStart w:id="54" w:name="exploratory-data-analysis"/>
-      <w:bookmarkStart w:id="55" w:name="_Toc240021248"/>
-      <w:bookmarkEnd w:id="44"/>
-      <w:bookmarkEnd w:id="52"/>
+      <w:bookmarkStart w:id="54" w:name="_Toc240021248"/>
+      <w:bookmarkStart w:id="55" w:name="exploratory-data-analysis"/>
+      <w:bookmarkEnd w:id="45"/>
+      <w:bookmarkEnd w:id="53"/>
       <w:r>
         <w:lastRenderedPageBreak/>
         <w:t>Exploratory Data Analysis</w:t>
       </w:r>
-      <w:bookmarkEnd w:id="55"/>
+      <w:bookmarkEnd w:id="54"/>
     </w:p>
     <w:p>
       <w:pPr>
@@ -10930,12 +10936,12 @@
       <w:pPr>
         <w:pStyle w:val="Heading2"/>
       </w:pPr>
-      <w:bookmarkStart w:id="56" w:name="principal-finding-overtime"/>
-      <w:bookmarkStart w:id="57" w:name="_Toc240021249"/>
+      <w:bookmarkStart w:id="56" w:name="_Toc240021249"/>
+      <w:bookmarkStart w:id="57" w:name="principal-finding-overtime"/>
       <w:r>
         <w:t>Principal finding: overtime</w:t>
       </w:r>
-      <w:bookmarkEnd w:id="57"/>
+      <w:bookmarkEnd w:id="56"/>
     </w:p>
     <w:p>
       <w:pPr>
@@ -11012,13 +11018,13 @@
       <w:pPr>
         <w:pStyle w:val="Heading2"/>
       </w:pPr>
-      <w:bookmarkStart w:id="58" w:name="principal-finding-compensation"/>
-      <w:bookmarkStart w:id="59" w:name="_Toc240021250"/>
-      <w:bookmarkEnd w:id="56"/>
+      <w:bookmarkStart w:id="58" w:name="_Toc240021250"/>
+      <w:bookmarkStart w:id="59" w:name="principal-finding-compensation"/>
+      <w:bookmarkEnd w:id="57"/>
       <w:r>
         <w:t>Principal finding: compensation</w:t>
       </w:r>
-      <w:bookmarkEnd w:id="59"/>
+      <w:bookmarkEnd w:id="58"/>
     </w:p>
     <w:p>
       <w:pPr>
@@ -11118,14 +11124,14 @@
       <w:pPr>
         <w:pStyle w:val="Heading2"/>
       </w:pPr>
-      <w:bookmarkStart w:id="60" w:name="correlation-structure"/>
-      <w:bookmarkStart w:id="61" w:name="_Toc240021251"/>
-      <w:bookmarkEnd w:id="58"/>
+      <w:bookmarkStart w:id="60" w:name="_Toc240021251"/>
+      <w:bookmarkStart w:id="61" w:name="correlation-structure"/>
+      <w:bookmarkEnd w:id="59"/>
       <w:r>
         <w:lastRenderedPageBreak/>
         <w:t>Correlation structure</w:t>
       </w:r>
-      <w:bookmarkEnd w:id="61"/>
+      <w:bookmarkEnd w:id="60"/>
     </w:p>
     <w:p>
       <w:pPr>
@@ -11202,13 +11208,13 @@
       <w:pPr>
         <w:pStyle w:val="Heading2"/>
       </w:pPr>
-      <w:bookmarkStart w:id="62" w:name="supporting-findings"/>
-      <w:bookmarkStart w:id="63" w:name="_Toc240021252"/>
-      <w:bookmarkEnd w:id="60"/>
+      <w:bookmarkStart w:id="62" w:name="_Toc240021252"/>
+      <w:bookmarkStart w:id="63" w:name="supporting-findings"/>
+      <w:bookmarkEnd w:id="61"/>
       <w:r>
         <w:t>Supporting findings</w:t>
       </w:r>
-      <w:bookmarkEnd w:id="63"/>
+      <w:bookmarkEnd w:id="62"/>
     </w:p>
     <w:p>
       <w:pPr>
@@ -11447,13 +11453,13 @@
       <w:pPr>
         <w:pStyle w:val="Heading2"/>
       </w:pPr>
-      <w:bookmarkStart w:id="64" w:name="data-sufficiency"/>
-      <w:bookmarkStart w:id="65" w:name="_Toc240021253"/>
-      <w:bookmarkEnd w:id="62"/>
+      <w:bookmarkStart w:id="64" w:name="_Toc240021253"/>
+      <w:bookmarkStart w:id="65" w:name="data-sufficiency"/>
+      <w:bookmarkEnd w:id="63"/>
       <w:r>
         <w:t>Data sufficiency</w:t>
       </w:r>
-      <w:bookmarkEnd w:id="65"/>
+      <w:bookmarkEnd w:id="64"/>
     </w:p>
     <w:p>
       <w:pPr>
@@ -11539,13 +11545,13 @@
       <w:pPr>
         <w:pStyle w:val="Heading2"/>
       </w:pPr>
-      <w:bookmarkStart w:id="66" w:name="follow-up-questions-for-the-client"/>
-      <w:bookmarkStart w:id="67" w:name="_Toc240021254"/>
-      <w:bookmarkEnd w:id="64"/>
+      <w:bookmarkStart w:id="66" w:name="_Toc240021254"/>
+      <w:bookmarkStart w:id="67" w:name="follow-up-questions-for-the-client"/>
+      <w:bookmarkEnd w:id="65"/>
       <w:r>
         <w:t>Follow-up questions for the client</w:t>
       </w:r>
-      <w:bookmarkEnd w:id="67"/>
+      <w:bookmarkEnd w:id="66"/>
     </w:p>
     <w:p>
       <w:pPr>
@@ -11706,25 +11712,25 @@
       <w:pPr>
         <w:pStyle w:val="Heading1"/>
       </w:pPr>
-      <w:bookmarkStart w:id="68" w:name="methods-and-frameworks"/>
-      <w:bookmarkStart w:id="69" w:name="_Toc240021255"/>
-      <w:bookmarkEnd w:id="54"/>
-      <w:bookmarkEnd w:id="66"/>
+      <w:bookmarkStart w:id="68" w:name="_Toc240021255"/>
+      <w:bookmarkStart w:id="69" w:name="methods-and-frameworks"/>
+      <w:bookmarkEnd w:id="55"/>
+      <w:bookmarkEnd w:id="67"/>
       <w:r>
         <w:t>Methods and Frameworks</w:t>
       </w:r>
-      <w:bookmarkEnd w:id="69"/>
+      <w:bookmarkEnd w:id="68"/>
     </w:p>
     <w:p>
       <w:pPr>
         <w:pStyle w:val="Heading2"/>
       </w:pPr>
-      <w:bookmarkStart w:id="70" w:name="overall-approach"/>
-      <w:bookmarkStart w:id="71" w:name="_Toc240021256"/>
+      <w:bookmarkStart w:id="70" w:name="_Toc240021256"/>
+      <w:bookmarkStart w:id="71" w:name="overall-approach"/>
       <w:r>
         <w:t>Overall Approach</w:t>
       </w:r>
-      <w:bookmarkEnd w:id="71"/>
+      <w:bookmarkEnd w:id="70"/>
     </w:p>
     <w:p>
       <w:pPr>
@@ -12022,13 +12028,13 @@
       <w:pPr>
         <w:pStyle w:val="Heading2"/>
       </w:pPr>
-      <w:bookmarkStart w:id="72" w:name="tools-and-technologies"/>
-      <w:bookmarkStart w:id="73" w:name="_Toc240021257"/>
-      <w:bookmarkEnd w:id="70"/>
+      <w:bookmarkStart w:id="72" w:name="_Toc240021257"/>
+      <w:bookmarkStart w:id="73" w:name="tools-and-technologies"/>
+      <w:bookmarkEnd w:id="71"/>
       <w:r>
         <w:t>Tools and Technologies</w:t>
       </w:r>
-      <w:bookmarkEnd w:id="73"/>
+      <w:bookmarkEnd w:id="72"/>
     </w:p>
     <w:tbl>
       <w:tblPr>
@@ -12477,13 +12483,13 @@
       <w:pPr>
         <w:pStyle w:val="Heading2"/>
       </w:pPr>
-      <w:bookmarkStart w:id="74" w:name="Xfd7ed6f3863d15655ce690eac3d46ac191430bb"/>
-      <w:bookmarkStart w:id="75" w:name="_Toc240021258"/>
-      <w:bookmarkEnd w:id="72"/>
+      <w:bookmarkStart w:id="74" w:name="_Toc240021258"/>
+      <w:bookmarkStart w:id="75" w:name="Xfd7ed6f3863d15655ce690eac3d46ac191430bb"/>
+      <w:bookmarkEnd w:id="73"/>
       <w:r>
         <w:t>Alignment with Project Goals and Deliverables</w:t>
       </w:r>
-      <w:bookmarkEnd w:id="75"/>
+      <w:bookmarkEnd w:id="74"/>
     </w:p>
     <w:tbl>
       <w:tblPr>
@@ -12848,91 +12854,91 @@
       <w:pPr>
         <w:pStyle w:val="Heading1"/>
       </w:pPr>
-      <w:bookmarkStart w:id="76" w:name="architect-the-solution-proof-of-concept"/>
-      <w:bookmarkStart w:id="77" w:name="_Toc240021259"/>
-      <w:bookmarkEnd w:id="68"/>
-      <w:bookmarkEnd w:id="74"/>
+      <w:bookmarkStart w:id="76" w:name="_Toc240021259"/>
+      <w:bookmarkStart w:id="77" w:name="architect-the-solution-proof-of-concept"/>
+      <w:bookmarkEnd w:id="69"/>
+      <w:bookmarkEnd w:id="75"/>
       <w:r>
         <w:t>Architect the Solution: Proof of Concept</w:t>
       </w:r>
-      <w:bookmarkEnd w:id="77"/>
+      <w:bookmarkEnd w:id="76"/>
     </w:p>
     <w:p>
       <w:pPr>
         <w:pStyle w:val="Heading2"/>
       </w:pPr>
-      <w:bookmarkStart w:id="78" w:name="pipeline-construction"/>
-      <w:bookmarkStart w:id="79" w:name="_Toc240021260"/>
+      <w:bookmarkStart w:id="78" w:name="_Toc240021260"/>
+      <w:bookmarkStart w:id="79" w:name="pipeline-construction"/>
       <w:r>
         <w:t>Pipeline construction</w:t>
       </w:r>
+      <w:bookmarkEnd w:id="78"/>
+    </w:p>
+    <w:p>
+      <w:pPr>
+        <w:pStyle w:val="FirstParagraph"/>
+      </w:pPr>
+      <w:r>
+        <w:t xml:space="preserve">The solution is a single </w:t>
+      </w:r>
+      <w:r>
+        <w:rPr>
+          <w:rStyle w:val="VerbatimChar"/>
+        </w:rPr>
+        <w:t>sklearn.pipeline.Pipeline</w:t>
+      </w:r>
+      <w:r>
+        <w:t xml:space="preserve"> encapsulating every transformation and the estimator, so the artefact validated is the artefact deployed. Preprocessing is a </w:t>
+      </w:r>
+      <w:r>
+        <w:rPr>
+          <w:rStyle w:val="VerbatimChar"/>
+        </w:rPr>
+        <w:t>ColumnTransformer</w:t>
+      </w:r>
+      <w:r>
+        <w:t xml:space="preserve"> applying </w:t>
+      </w:r>
+      <w:r>
+        <w:rPr>
+          <w:rStyle w:val="VerbatimChar"/>
+        </w:rPr>
+        <w:t>StandardScaler</w:t>
+      </w:r>
+      <w:r>
+        <w:t xml:space="preserve"> to 21 numeric columns and </w:t>
+      </w:r>
+      <w:r>
+        <w:rPr>
+          <w:rStyle w:val="VerbatimChar"/>
+        </w:rPr>
+        <w:t>OneHotEncoder</w:t>
+      </w:r>
+      <w:r>
+        <w:t xml:space="preserve"> to 5 categorical columns; this is composed with the estimator, and the composite object is the unit passed to every fitting call. </w:t>
+      </w:r>
+      <w:r>
+        <w:rPr>
+          <w:rStyle w:val="VerbatimChar"/>
+        </w:rPr>
+        <w:t>fit</w:t>
+      </w:r>
+      <w:r>
+        <w:t xml:space="preserve"> is therefore only ever called on training data, and leakage is prevented structurally.</w:t>
+      </w:r>
+    </w:p>
+    <w:p>
+      <w:pPr>
+        <w:pStyle w:val="Heading2"/>
+      </w:pPr>
+      <w:bookmarkStart w:id="80" w:name="_Toc240021261"/>
+      <w:bookmarkStart w:id="81" w:name="model-comparison"/>
       <w:bookmarkEnd w:id="79"/>
-    </w:p>
-    <w:p>
-      <w:pPr>
-        <w:pStyle w:val="FirstParagraph"/>
-      </w:pPr>
-      <w:r>
-        <w:t xml:space="preserve">The solution is a single </w:t>
-      </w:r>
-      <w:r>
-        <w:rPr>
-          <w:rStyle w:val="VerbatimChar"/>
-        </w:rPr>
-        <w:t>sklearn.pipeline.Pipeline</w:t>
-      </w:r>
-      <w:r>
-        <w:t xml:space="preserve"> encapsulating every transformation and the estimator, so the artefact validated is the artefact deployed. Preprocessing is a </w:t>
-      </w:r>
-      <w:r>
-        <w:rPr>
-          <w:rStyle w:val="VerbatimChar"/>
-        </w:rPr>
-        <w:t>ColumnTransformer</w:t>
-      </w:r>
-      <w:r>
-        <w:t xml:space="preserve"> applying </w:t>
-      </w:r>
-      <w:r>
-        <w:rPr>
-          <w:rStyle w:val="VerbatimChar"/>
-        </w:rPr>
-        <w:t>StandardScaler</w:t>
-      </w:r>
-      <w:r>
-        <w:t xml:space="preserve"> to 21 numeric columns and </w:t>
-      </w:r>
-      <w:r>
-        <w:rPr>
-          <w:rStyle w:val="VerbatimChar"/>
-        </w:rPr>
-        <w:t>OneHotEncoder</w:t>
-      </w:r>
-      <w:r>
-        <w:t xml:space="preserve"> to 5 categorical columns; this is composed with the estimator, and the composite object is the unit passed to every fitting call. </w:t>
-      </w:r>
-      <w:r>
-        <w:rPr>
-          <w:rStyle w:val="VerbatimChar"/>
-        </w:rPr>
-        <w:t>fit</w:t>
-      </w:r>
-      <w:r>
-        <w:t xml:space="preserve"> is therefore only ever called on training data, and leakage is prevented structurally.</w:t>
-      </w:r>
-    </w:p>
-    <w:p>
-      <w:pPr>
-        <w:pStyle w:val="Heading2"/>
-      </w:pPr>
-      <w:bookmarkStart w:id="80" w:name="model-comparison"/>
-      <w:bookmarkStart w:id="81" w:name="_Toc240021261"/>
-      <w:bookmarkEnd w:id="78"/>
       <w:r>
         <w:lastRenderedPageBreak/>
         <w:t>Model comparison</w:t>
       </w:r>
-      <w:bookmarkEnd w:id="81"/>
+      <w:bookmarkEnd w:id="80"/>
     </w:p>
     <w:p>
       <w:pPr>
@@ -13176,13 +13182,13 @@
       <w:pPr>
         <w:pStyle w:val="Heading2"/>
       </w:pPr>
-      <w:bookmarkStart w:id="82" w:name="out-of-fold-performance"/>
-      <w:bookmarkStart w:id="83" w:name="_Toc240021262"/>
-      <w:bookmarkEnd w:id="80"/>
+      <w:bookmarkStart w:id="82" w:name="_Toc240021262"/>
+      <w:bookmarkStart w:id="83" w:name="out-of-fold-performance"/>
+      <w:bookmarkEnd w:id="81"/>
       <w:r>
         <w:t>Out-of-fold performance</w:t>
       </w:r>
-      <w:bookmarkEnd w:id="83"/>
+      <w:bookmarkEnd w:id="82"/>
     </w:p>
     <w:p>
       <w:pPr>
@@ -13599,13 +13605,13 @@
       <w:pPr>
         <w:pStyle w:val="Heading2"/>
       </w:pPr>
-      <w:bookmarkStart w:id="84" w:name="Xa77ae383efbc5b555164cc9f5d2b698bf3ba0c2"/>
-      <w:bookmarkStart w:id="85" w:name="_Toc240021263"/>
-      <w:bookmarkEnd w:id="82"/>
+      <w:bookmarkStart w:id="84" w:name="_Toc240021263"/>
+      <w:bookmarkStart w:id="85" w:name="Xa77ae383efbc5b555164cc9f5d2b698bf3ba0c2"/>
+      <w:bookmarkEnd w:id="83"/>
       <w:r>
         <w:t>Resolution against the registered success criteria</w:t>
       </w:r>
-      <w:bookmarkEnd w:id="85"/>
+      <w:bookmarkEnd w:id="84"/>
     </w:p>
     <w:tbl>
       <w:tblPr>
@@ -14191,14 +14197,14 @@
       <w:pPr>
         <w:pStyle w:val="Heading2"/>
       </w:pPr>
-      <w:bookmarkStart w:id="86" w:name="threshold-selection"/>
-      <w:bookmarkStart w:id="87" w:name="_Toc240021264"/>
-      <w:bookmarkEnd w:id="84"/>
+      <w:bookmarkStart w:id="86" w:name="_Toc240021264"/>
+      <w:bookmarkStart w:id="87" w:name="threshold-selection"/>
+      <w:bookmarkEnd w:id="85"/>
       <w:r>
         <w:lastRenderedPageBreak/>
         <w:t>Threshold selection</w:t>
       </w:r>
-      <w:bookmarkEnd w:id="87"/>
+      <w:bookmarkEnd w:id="86"/>
     </w:p>
     <w:p>
       <w:pPr>
@@ -14980,42 +14986,42 @@
       <w:pPr>
         <w:pStyle w:val="Heading2"/>
       </w:pPr>
-      <w:bookmarkStart w:id="88" w:name="Xe61b27eeb1fcf907987a73ccc10fc769dbf0356"/>
-      <w:bookmarkStart w:id="89" w:name="_Toc240021265"/>
-      <w:bookmarkEnd w:id="86"/>
+      <w:bookmarkStart w:id="88" w:name="_Toc240021265"/>
+      <w:bookmarkStart w:id="89" w:name="Xe61b27eeb1fcf907987a73ccc10fc769dbf0356"/>
+      <w:bookmarkEnd w:id="87"/>
       <w:r>
         <w:t>How the analytics opportunity is captured</w:t>
       </w:r>
+      <w:bookmarkEnd w:id="88"/>
+    </w:p>
+    <w:p>
+      <w:pPr>
+        <w:pStyle w:val="FirstParagraph"/>
+      </w:pPr>
+      <w:r>
+        <w:t>In the short term, the proof of concept converts a retrospective cost line into a ranked, priced worklist. Helix can direct retention spend at the employees most likely to leave rather than allocating by request or intuition.</w:t>
+      </w:r>
+    </w:p>
+    <w:p>
+      <w:pPr>
+        <w:pStyle w:val="BodyText"/>
+      </w:pPr>
+      <w:r>
+        <w:t>In the longer term, the deployed model becomes an instrument for testing organisational hypotheses. The overtime coefficient is not merely a predictor; it is a quantified argument for headcount investment in specific teams. The manager-tenure finding is a quantified argument for structuring managerial transitions. Once outcomes are logged against predictions, Helix accumulates the counterfactual evidence base that no volume of exit interviewing produces.</w:t>
+      </w:r>
+    </w:p>
+    <w:p>
+      <w:pPr>
+        <w:pStyle w:val="Heading1"/>
+      </w:pPr>
+      <w:bookmarkStart w:id="90" w:name="_Toc240021266"/>
+      <w:bookmarkStart w:id="91" w:name="fairness-and-proxy-audit"/>
+      <w:bookmarkEnd w:id="77"/>
       <w:bookmarkEnd w:id="89"/>
-    </w:p>
-    <w:p>
-      <w:pPr>
-        <w:pStyle w:val="FirstParagraph"/>
-      </w:pPr>
-      <w:r>
-        <w:t>In the short term, the proof of concept converts a retrospective cost line into a ranked, priced worklist. Helix can direct retention spend at the employees most likely to leave rather than allocating by request or intuition.</w:t>
-      </w:r>
-    </w:p>
-    <w:p>
-      <w:pPr>
-        <w:pStyle w:val="BodyText"/>
-      </w:pPr>
-      <w:r>
-        <w:t>In the longer term, the deployed model becomes an instrument for testing organisational hypotheses. The overtime coefficient is not merely a predictor; it is a quantified argument for headcount investment in specific teams. The manager-tenure finding is a quantified argument for structuring managerial transitions. Once outcomes are logged against predictions, Helix accumulates the counterfactual evidence base that no volume of exit interviewing produces.</w:t>
-      </w:r>
-    </w:p>
-    <w:p>
-      <w:pPr>
-        <w:pStyle w:val="Heading1"/>
-      </w:pPr>
-      <w:bookmarkStart w:id="90" w:name="fairness-and-proxy-audit"/>
-      <w:bookmarkStart w:id="91" w:name="_Toc240021266"/>
-      <w:bookmarkEnd w:id="76"/>
-      <w:bookmarkEnd w:id="88"/>
       <w:r>
         <w:t>Fairness and Proxy Audit</w:t>
       </w:r>
-      <w:bookmarkEnd w:id="91"/>
+      <w:bookmarkEnd w:id="90"/>
     </w:p>
     <w:p>
       <w:pPr>
@@ -15037,36 +15043,58 @@
         <w:t>Claim 1: the protected-attribute exclusions cost little.</w:t>
       </w:r>
       <w:r>
-        <w:t xml:space="preserve"> Measured across identical out-of-fold evaluation, excluding </w:t>
-      </w:r>
-      <w:r>
-        <w:rPr>
-          <w:rStyle w:val="VerbatimChar"/>
-        </w:rPr>
-        <w:t>DistanceFromHome</w:t>
-      </w:r>
-      <w:r>
-        <w:t xml:space="preserve"> costs </w:t>
+        <w:t xml:space="preserve"> </w:t>
+      </w:r>
+      <w:r>
+        <w:t xml:space="preserve">Measured across identical out-of-fold evaluation, an unrestricted model scores 0.8245 ROC-AUC. Excluding the three protected attributes costs </w:t>
       </w:r>
       <w:r>
         <w:rPr>
           <w:b/>
           <w:bCs/>
         </w:rPr>
-        <w:t>0.005 ROC-AUC</w:t>
-      </w:r>
-      <w:r>
-        <w:t xml:space="preserve"> (0.818 with, 0.813 without). The three protected attributes and the proxy feature together cost approximately 0.02 AUC relative to an unrestricted model. </w:t>
+        <w:t>0.006</w:t>
+      </w:r>
+      <w:r>
+        <w:t xml:space="preserve">; excluding </w:t>
+      </w:r>
+      <w:proofErr w:type="spellStart"/>
+      <w:r>
+        <w:rPr>
+          <w:rFonts w:ascii="Consolas" w:hAnsi="Consolas"/>
+        </w:rPr>
+        <w:t>DistanceFromHome</w:t>
+      </w:r>
+      <w:proofErr w:type="spellEnd"/>
+      <w:r>
+        <w:t xml:space="preserve"> on proxy-risk grounds costs a further </w:t>
       </w:r>
       <w:r>
         <w:rPr>
           <w:b/>
           <w:bCs/>
         </w:rPr>
-        <w:t>This is the price of the fairness constraint, and it is disclosed rather than assumed negligible.</w:t>
-      </w:r>
-      <w:r>
-        <w:t xml:space="preserve"> The trade is judged acceptable and the client makes it knowingly.</w:t>
+        <w:t>0.005</w:t>
+      </w:r>
+      <w:r>
+        <w:t xml:space="preserve">, taking the deployed model to 0.8134. </w:t>
+      </w:r>
+      <w:r>
+        <w:rPr>
+          <w:b/>
+          <w:bCs/>
+        </w:rPr>
+        <w:t>The fairness constraint therefore costs 0.011 ROC-AUC in total</w:t>
+      </w:r>
+      <w:r>
+        <w:rPr>
+          <w:b/>
+          <w:bCs/>
+        </w:rPr>
+        <w:t xml:space="preserve">. </w:t>
+      </w:r>
+      <w:r>
+        <w:t>The trade is judged acceptable and the client makes it knowingly.</w:t>
       </w:r>
     </w:p>
     <w:p>
@@ -15302,24 +15330,24 @@
       <w:pPr>
         <w:pStyle w:val="Heading1"/>
       </w:pPr>
-      <w:bookmarkStart w:id="92" w:name="evaluate-business-value-cost-analysis"/>
-      <w:bookmarkStart w:id="93" w:name="_Toc240021267"/>
-      <w:bookmarkEnd w:id="90"/>
+      <w:bookmarkStart w:id="92" w:name="_Toc240021267"/>
+      <w:bookmarkStart w:id="93" w:name="evaluate-business-value-cost-analysis"/>
+      <w:bookmarkEnd w:id="91"/>
       <w:r>
         <w:t>Evaluate Business Value: Cost Analysis</w:t>
       </w:r>
-      <w:bookmarkEnd w:id="93"/>
+      <w:bookmarkEnd w:id="92"/>
     </w:p>
     <w:p>
       <w:pPr>
         <w:pStyle w:val="Heading2"/>
       </w:pPr>
-      <w:bookmarkStart w:id="94" w:name="capital-requirements"/>
-      <w:bookmarkStart w:id="95" w:name="_Toc240021268"/>
+      <w:bookmarkStart w:id="94" w:name="_Toc240021268"/>
+      <w:bookmarkStart w:id="95" w:name="capital-requirements"/>
       <w:r>
         <w:t>Capital Requirements</w:t>
       </w:r>
-      <w:bookmarkEnd w:id="95"/>
+      <w:bookmarkEnd w:id="94"/>
     </w:p>
     <w:p>
       <w:pPr>
@@ -15666,13 +15694,13 @@
       <w:pPr>
         <w:pStyle w:val="Heading2"/>
       </w:pPr>
-      <w:bookmarkStart w:id="96" w:name="summary-of-cost-analysis"/>
-      <w:bookmarkStart w:id="97" w:name="_Toc240021269"/>
-      <w:bookmarkEnd w:id="94"/>
+      <w:bookmarkStart w:id="96" w:name="_Toc240021269"/>
+      <w:bookmarkStart w:id="97" w:name="summary-of-cost-analysis"/>
+      <w:bookmarkEnd w:id="95"/>
       <w:r>
         <w:t>Summary of Cost Analysis</w:t>
       </w:r>
-      <w:bookmarkEnd w:id="97"/>
+      <w:bookmarkEnd w:id="96"/>
     </w:p>
     <w:p>
       <w:pPr>
@@ -16535,13 +16563,13 @@
       <w:pPr>
         <w:pStyle w:val="Heading2"/>
       </w:pPr>
-      <w:bookmarkStart w:id="98" w:name="Xc844ba382df92a6eb390c7d02b185b63a4349ee"/>
-      <w:bookmarkStart w:id="99" w:name="_Toc240021270"/>
-      <w:bookmarkEnd w:id="96"/>
+      <w:bookmarkStart w:id="98" w:name="_Toc240021270"/>
+      <w:bookmarkStart w:id="99" w:name="Xc844ba382df92a6eb390c7d02b185b63a4349ee"/>
+      <w:bookmarkEnd w:id="97"/>
       <w:r>
         <w:t>The observation window: the dominant sensitivity</w:t>
       </w:r>
-      <w:bookmarkEnd w:id="99"/>
+      <w:bookmarkEnd w:id="98"/>
     </w:p>
     <w:p>
       <w:pPr>
@@ -17208,13 +17236,13 @@
       <w:pPr>
         <w:pStyle w:val="Heading2"/>
       </w:pPr>
-      <w:bookmarkStart w:id="100" w:name="Xea6821b2966d27ae84429c612ebc40e7bf29a79"/>
-      <w:bookmarkStart w:id="101" w:name="_Toc240021271"/>
-      <w:bookmarkEnd w:id="98"/>
+      <w:bookmarkStart w:id="100" w:name="_Toc240021271"/>
+      <w:bookmarkStart w:id="101" w:name="Xea6821b2966d27ae84429c612ebc40e7bf29a79"/>
+      <w:bookmarkEnd w:id="99"/>
       <w:r>
         <w:t>Recommended case, one-year window, threshold 0.60</w:t>
       </w:r>
-      <w:bookmarkEnd w:id="101"/>
+      <w:bookmarkEnd w:id="100"/>
     </w:p>
     <w:tbl>
       <w:tblPr>
@@ -17579,13 +17607,13 @@
       <w:pPr>
         <w:pStyle w:val="Heading2"/>
       </w:pPr>
-      <w:bookmarkStart w:id="102" w:name="roi-analysis"/>
-      <w:bookmarkStart w:id="103" w:name="_Toc240021272"/>
-      <w:bookmarkEnd w:id="100"/>
+      <w:bookmarkStart w:id="102" w:name="_Toc240021272"/>
+      <w:bookmarkStart w:id="103" w:name="roi-analysis"/>
+      <w:bookmarkEnd w:id="101"/>
       <w:r>
         <w:t>ROI Analysis</w:t>
       </w:r>
-      <w:bookmarkEnd w:id="103"/>
+      <w:bookmarkEnd w:id="102"/>
     </w:p>
     <w:tbl>
       <w:tblPr>
@@ -17873,20 +17901,32 @@
               <w:pStyle w:val="Compact"/>
             </w:pPr>
             <w:r>
-              <w:t>≈ $3.6m</w:t>
-            </w:r>
-          </w:p>
-        </w:tc>
-        <w:tc>
-          <w:tcPr>
-            <w:tcW w:w="0" w:type="auto"/>
-          </w:tcPr>
-          <w:p>
-            <w:pPr>
-              <w:pStyle w:val="Compact"/>
-            </w:pPr>
-            <w:r>
-              <w:t>160%</w:t>
+              <w:t>≈ $3.</w:t>
+            </w:r>
+            <w:r>
+              <w:t>5</w:t>
+            </w:r>
+            <w:r>
+              <w:t>m</w:t>
+            </w:r>
+          </w:p>
+        </w:tc>
+        <w:tc>
+          <w:tcPr>
+            <w:tcW w:w="0" w:type="auto"/>
+          </w:tcPr>
+          <w:p>
+            <w:pPr>
+              <w:pStyle w:val="Compact"/>
+            </w:pPr>
+            <w:r>
+              <w:t>1</w:t>
+            </w:r>
+            <w:r>
+              <w:t>57</w:t>
+            </w:r>
+            <w:r>
+              <w:t>%</w:t>
             </w:r>
           </w:p>
         </w:tc>
@@ -18178,13 +18218,13 @@
       <w:pPr>
         <w:pStyle w:val="Heading2"/>
       </w:pPr>
-      <w:bookmarkStart w:id="104" w:name="risk-reward-analysis"/>
-      <w:bookmarkStart w:id="105" w:name="_Toc240021273"/>
-      <w:bookmarkEnd w:id="102"/>
+      <w:bookmarkStart w:id="104" w:name="_Toc240021273"/>
+      <w:bookmarkStart w:id="105" w:name="risk-reward-analysis"/>
+      <w:bookmarkEnd w:id="103"/>
       <w:r>
         <w:t>Risk &amp; Reward Analysis</w:t>
       </w:r>
-      <w:bookmarkEnd w:id="105"/>
+      <w:bookmarkEnd w:id="104"/>
     </w:p>
     <w:p>
       <w:pPr>
@@ -19006,14 +19046,14 @@
       <w:pPr>
         <w:pStyle w:val="Heading1"/>
       </w:pPr>
-      <w:bookmarkStart w:id="106" w:name="X256df6ebb39e519c7b5f232c9a39f02a0fa3820"/>
-      <w:bookmarkStart w:id="107" w:name="_Toc240021274"/>
-      <w:bookmarkEnd w:id="92"/>
-      <w:bookmarkEnd w:id="104"/>
+      <w:bookmarkStart w:id="106" w:name="_Toc240021274"/>
+      <w:bookmarkStart w:id="107" w:name="X256df6ebb39e519c7b5f232c9a39f02a0fa3820"/>
+      <w:bookmarkEnd w:id="93"/>
+      <w:bookmarkEnd w:id="105"/>
       <w:r>
         <w:t>Methodological Limitations and Assumptions</w:t>
       </w:r>
-      <w:bookmarkEnd w:id="107"/>
+      <w:bookmarkEnd w:id="106"/>
     </w:p>
     <w:p>
       <w:pPr>
@@ -19265,24 +19305,24 @@
       <w:pPr>
         <w:pStyle w:val="Heading1"/>
       </w:pPr>
-      <w:bookmarkStart w:id="108" w:name="scale-up-the-poc-recommendations"/>
-      <w:bookmarkStart w:id="109" w:name="_Toc240021275"/>
-      <w:bookmarkEnd w:id="106"/>
+      <w:bookmarkStart w:id="108" w:name="_Toc240021275"/>
+      <w:bookmarkStart w:id="109" w:name="scale-up-the-poc-recommendations"/>
+      <w:bookmarkEnd w:id="107"/>
       <w:r>
         <w:t>Scale up the POC: Recommendations</w:t>
       </w:r>
-      <w:bookmarkEnd w:id="109"/>
+      <w:bookmarkEnd w:id="108"/>
     </w:p>
     <w:p>
       <w:pPr>
         <w:pStyle w:val="Heading2"/>
       </w:pPr>
-      <w:bookmarkStart w:id="110" w:name="alternative-options-considered"/>
-      <w:bookmarkStart w:id="111" w:name="_Toc240021276"/>
+      <w:bookmarkStart w:id="110" w:name="_Toc240021276"/>
+      <w:bookmarkStart w:id="111" w:name="alternative-options-considered"/>
       <w:r>
         <w:t>Alternative options considered</w:t>
       </w:r>
-      <w:bookmarkEnd w:id="111"/>
+      <w:bookmarkEnd w:id="110"/>
     </w:p>
     <w:p>
       <w:pPr>
@@ -19323,14 +19363,14 @@
       <w:pPr>
         <w:pStyle w:val="Heading2"/>
       </w:pPr>
-      <w:bookmarkStart w:id="112" w:name="deployment-roadmap"/>
-      <w:bookmarkStart w:id="113" w:name="_Toc240021277"/>
-      <w:bookmarkEnd w:id="110"/>
+      <w:bookmarkStart w:id="112" w:name="_Toc240021277"/>
+      <w:bookmarkStart w:id="113" w:name="deployment-roadmap"/>
+      <w:bookmarkEnd w:id="111"/>
       <w:r>
         <w:lastRenderedPageBreak/>
         <w:t>Deployment roadmap</w:t>
       </w:r>
-      <w:bookmarkEnd w:id="113"/>
+      <w:bookmarkEnd w:id="112"/>
     </w:p>
     <w:p>
       <w:pPr>
@@ -19490,13 +19530,13 @@
       <w:pPr>
         <w:pStyle w:val="Heading2"/>
       </w:pPr>
-      <w:bookmarkStart w:id="114" w:name="what-scalable-means-here"/>
-      <w:bookmarkStart w:id="115" w:name="_Toc240021278"/>
-      <w:bookmarkEnd w:id="112"/>
+      <w:bookmarkStart w:id="114" w:name="_Toc240021278"/>
+      <w:bookmarkStart w:id="115" w:name="what-scalable-means-here"/>
+      <w:bookmarkEnd w:id="113"/>
       <w:r>
         <w:t>What “scalable” means here</w:t>
       </w:r>
-      <w:bookmarkEnd w:id="115"/>
+      <w:bookmarkEnd w:id="114"/>
     </w:p>
     <w:p>
       <w:pPr>
@@ -19584,13 +19624,13 @@
       <w:pPr>
         <w:pStyle w:val="Heading2"/>
       </w:pPr>
-      <w:bookmarkStart w:id="116" w:name="model-retraining-and-monitoring-schedule"/>
-      <w:bookmarkStart w:id="117" w:name="_Toc240021279"/>
-      <w:bookmarkEnd w:id="114"/>
+      <w:bookmarkStart w:id="116" w:name="_Toc240021279"/>
+      <w:bookmarkStart w:id="117" w:name="model-retraining-and-monitoring-schedule"/>
+      <w:bookmarkEnd w:id="115"/>
       <w:r>
         <w:t>Model retraining and monitoring schedule</w:t>
       </w:r>
-      <w:bookmarkEnd w:id="117"/>
+      <w:bookmarkEnd w:id="116"/>
     </w:p>
     <w:tbl>
       <w:tblPr>
@@ -19886,13 +19926,13 @@
       <w:pPr>
         <w:pStyle w:val="Heading2"/>
       </w:pPr>
-      <w:bookmarkStart w:id="118" w:name="ethical-ai-governance-provisions"/>
-      <w:bookmarkStart w:id="119" w:name="_Toc240021280"/>
-      <w:bookmarkEnd w:id="116"/>
+      <w:bookmarkStart w:id="118" w:name="_Toc240021280"/>
+      <w:bookmarkStart w:id="119" w:name="ethical-ai-governance-provisions"/>
+      <w:bookmarkEnd w:id="117"/>
       <w:r>
         <w:t>Ethical AI governance provisions</w:t>
       </w:r>
-      <w:bookmarkEnd w:id="119"/>
+      <w:bookmarkEnd w:id="118"/>
     </w:p>
     <w:p>
       <w:pPr>
@@ -20061,13 +20101,13 @@
       <w:pPr>
         <w:pStyle w:val="Heading2"/>
       </w:pPr>
-      <w:bookmarkStart w:id="120" w:name="concluding-recommendation"/>
-      <w:bookmarkStart w:id="121" w:name="_Toc240021281"/>
-      <w:bookmarkEnd w:id="118"/>
+      <w:bookmarkStart w:id="120" w:name="_Toc240021281"/>
+      <w:bookmarkStart w:id="121" w:name="concluding-recommendation"/>
+      <w:bookmarkEnd w:id="119"/>
       <w:r>
         <w:t>Concluding recommendation</w:t>
       </w:r>
-      <w:bookmarkEnd w:id="121"/>
+      <w:bookmarkEnd w:id="120"/>
     </w:p>
     <w:p>
       <w:pPr>
@@ -20160,14 +20200,14 @@
       <w:pPr>
         <w:pStyle w:val="Heading1"/>
       </w:pPr>
-      <w:bookmarkStart w:id="122" w:name="references"/>
-      <w:bookmarkStart w:id="123" w:name="_Toc240021282"/>
-      <w:bookmarkEnd w:id="108"/>
-      <w:bookmarkEnd w:id="120"/>
+      <w:bookmarkStart w:id="122" w:name="_Toc240021282"/>
+      <w:bookmarkStart w:id="123" w:name="references"/>
+      <w:bookmarkEnd w:id="109"/>
+      <w:bookmarkEnd w:id="121"/>
       <w:r>
         <w:t>References</w:t>
       </w:r>
-      <w:bookmarkEnd w:id="123"/>
+      <w:bookmarkEnd w:id="122"/>
     </w:p>
     <w:p>
       <w:pPr>
@@ -20402,24 +20442,24 @@
       <w:pPr>
         <w:pStyle w:val="Heading1"/>
       </w:pPr>
-      <w:bookmarkStart w:id="124" w:name="appendix"/>
-      <w:bookmarkStart w:id="125" w:name="_Toc240021283"/>
-      <w:bookmarkEnd w:id="122"/>
+      <w:bookmarkStart w:id="124" w:name="_Toc240021283"/>
+      <w:bookmarkStart w:id="125" w:name="appendix"/>
+      <w:bookmarkEnd w:id="123"/>
       <w:r>
         <w:t>Appendix</w:t>
       </w:r>
-      <w:bookmarkEnd w:id="125"/>
+      <w:bookmarkEnd w:id="124"/>
     </w:p>
     <w:p>
       <w:pPr>
         <w:pStyle w:val="Heading2"/>
       </w:pPr>
-      <w:bookmarkStart w:id="126" w:name="appendix-a-code-repository"/>
-      <w:bookmarkStart w:id="127" w:name="_Toc240021284"/>
+      <w:bookmarkStart w:id="126" w:name="_Toc240021284"/>
+      <w:bookmarkStart w:id="127" w:name="appendix-a-code-repository"/>
       <w:r>
         <w:t>Appendix A — Code repository</w:t>
       </w:r>
-      <w:bookmarkEnd w:id="127"/>
+      <w:bookmarkEnd w:id="126"/>
     </w:p>
     <w:p>
       <w:pPr>
@@ -20508,13 +20548,13 @@
       <w:pPr>
         <w:pStyle w:val="Heading2"/>
       </w:pPr>
-      <w:bookmarkStart w:id="128" w:name="appendix-b-interactive-visualisations"/>
-      <w:bookmarkStart w:id="129" w:name="_Toc240021285"/>
-      <w:bookmarkEnd w:id="126"/>
+      <w:bookmarkStart w:id="128" w:name="_Toc240021285"/>
+      <w:bookmarkStart w:id="129" w:name="appendix-b-interactive-visualisations"/>
+      <w:bookmarkEnd w:id="127"/>
       <w:r>
         <w:t>Appendix B — Interactive visualisations</w:t>
       </w:r>
-      <w:bookmarkEnd w:id="129"/>
+      <w:bookmarkEnd w:id="128"/>
     </w:p>
     <w:p>
       <w:pPr>
@@ -20535,19 +20575,7 @@
           <w:rPr>
             <w:rStyle w:val="Hyperlink"/>
           </w:rPr>
-          <w:t>Helix Systems Employee Retention An</w:t>
-        </w:r>
-        <w:r>
-          <w:rPr>
-            <w:rStyle w:val="Hyperlink"/>
-          </w:rPr>
-          <w:t>a</w:t>
-        </w:r>
-        <w:r>
-          <w:rPr>
-            <w:rStyle w:val="Hyperlink"/>
-          </w:rPr>
-          <w:t>lytics Dashboard</w:t>
+          <w:t>Helix Systems Employee Retention Analytics Dashboard</w:t>
         </w:r>
       </w:hyperlink>
     </w:p>
@@ -20582,13 +20610,13 @@
       <w:pPr>
         <w:pStyle w:val="Heading2"/>
       </w:pPr>
-      <w:bookmarkStart w:id="130" w:name="appendix-c-deliverable-manifest"/>
-      <w:bookmarkStart w:id="131" w:name="_Toc240021286"/>
-      <w:bookmarkEnd w:id="128"/>
+      <w:bookmarkStart w:id="130" w:name="_Toc240021286"/>
+      <w:bookmarkStart w:id="131" w:name="appendix-c-deliverable-manifest"/>
+      <w:bookmarkEnd w:id="129"/>
       <w:r>
         <w:t>Appendix C — Deliverable manifest</w:t>
       </w:r>
-      <w:bookmarkEnd w:id="131"/>
+      <w:bookmarkEnd w:id="130"/>
     </w:p>
     <w:tbl>
       <w:tblPr>
@@ -20897,13 +20925,13 @@
       <w:pPr>
         <w:pStyle w:val="Heading2"/>
       </w:pPr>
-      <w:bookmarkStart w:id="132" w:name="appendix-d-dataset-schema"/>
-      <w:bookmarkStart w:id="133" w:name="_Toc240021287"/>
-      <w:bookmarkEnd w:id="130"/>
+      <w:bookmarkStart w:id="132" w:name="_Toc240021287"/>
+      <w:bookmarkStart w:id="133" w:name="appendix-d-dataset-schema"/>
+      <w:bookmarkEnd w:id="131"/>
       <w:r>
         <w:t>Appendix D — Dataset schema</w:t>
       </w:r>
-      <w:bookmarkEnd w:id="133"/>
+      <w:bookmarkEnd w:id="132"/>
     </w:p>
     <w:p>
       <w:pPr>
@@ -23489,14 +23517,14 @@
       <w:pPr>
         <w:pStyle w:val="Heading2"/>
       </w:pPr>
-      <w:bookmarkStart w:id="134" w:name="appendix-e-model-coefficients"/>
-      <w:bookmarkStart w:id="135" w:name="_Toc240021288"/>
-      <w:bookmarkEnd w:id="132"/>
+      <w:bookmarkStart w:id="134" w:name="_Toc240021288"/>
+      <w:bookmarkStart w:id="135" w:name="appendix-e-model-coefficients"/>
+      <w:bookmarkEnd w:id="133"/>
       <w:r>
         <w:lastRenderedPageBreak/>
         <w:t>Appendix E — Model coefficients</w:t>
       </w:r>
-      <w:bookmarkEnd w:id="135"/>
+      <w:bookmarkEnd w:id="134"/>
     </w:p>
     <w:p>
       <w:pPr>
@@ -23680,13 +23708,13 @@
       <w:pPr>
         <w:pStyle w:val="Heading2"/>
       </w:pPr>
-      <w:bookmarkStart w:id="136" w:name="appendix-f-full-threshold-sweep"/>
-      <w:bookmarkStart w:id="137" w:name="_Toc240021289"/>
-      <w:bookmarkEnd w:id="134"/>
+      <w:bookmarkStart w:id="136" w:name="_Toc240021289"/>
+      <w:bookmarkStart w:id="137" w:name="appendix-f-full-threshold-sweep"/>
+      <w:bookmarkEnd w:id="135"/>
       <w:r>
         <w:t>Appendix F — Full threshold sweep</w:t>
       </w:r>
-      <w:bookmarkEnd w:id="137"/>
+      <w:bookmarkEnd w:id="136"/>
     </w:p>
     <w:p>
       <w:pPr>
@@ -25144,8 +25172,8 @@
       <w:r>
         <w:t>Net value peaks at 0.60 and is broadly flat across 0.50–0.70; the operating point is therefore reinforced by precision, capacity and threshold stability rather than resting on dollars alone. Percentage ROI rises monotonically with the threshold because the intervention base shrinks — Helix should optimise for absolute value within the plateau, not for return efficiency on a smaller budget.</w:t>
       </w:r>
-      <w:bookmarkEnd w:id="124"/>
-      <w:bookmarkEnd w:id="136"/>
+      <w:bookmarkEnd w:id="125"/>
+      <w:bookmarkEnd w:id="137"/>
     </w:p>
     <w:sectPr>
       <w:pgSz w:w="12240" w:h="15840"/>
@@ -26124,7 +26152,6 @@
   <w:style w:type="character" w:default="1" w:styleId="DefaultParagraphFont">
     <w:name w:val="Default Paragraph Font"/>
     <w:uiPriority w:val="1"/>
-    <w:semiHidden/>
     <w:unhideWhenUsed/>
   </w:style>
   <w:style w:type="table" w:default="1" w:styleId="TableNormal">

</xml_diff>